<commit_message>
Resume: Cyber Security Internships in Mathura: Find 40 Best Cyber Security Intern Jobs in Mathura @ Unknown (unknown)
</commit_message>
<xml_diff>
--- a/resumes/Resume_Cyber_Security_Internships_in_Mathu_Unknown__unknown_.docx
+++ b/resumes/Resume_Cyber_Security_Internships_in_Mathu_Unknown__unknown_.docx
@@ -506,13 +506,13 @@
         <mc:AlternateContent>
           <mc:Choice Requires="wps">
             <w:drawing>
-              <wp:anchor distT="0" distB="0" distL="114300" distR="114300" simplePos="0" relativeHeight="251659264" behindDoc="0" locked="0" layoutInCell="1" allowOverlap="1" wp14:anchorId="491819C8" wp14:editId="6BC13A2A">
+              <wp:anchor distT="0" distB="0" distL="114300" distR="114300" simplePos="0" relativeHeight="251659264" behindDoc="0" locked="0" layoutInCell="1" allowOverlap="1" wp14:anchorId="491819C8" wp14:editId="73B92A3A">
                 <wp:simplePos x="0" y="0"/>
                 <wp:positionH relativeFrom="column">
                   <wp:posOffset>0</wp:posOffset>
                 </wp:positionH>
                 <wp:positionV relativeFrom="paragraph">
-                  <wp:posOffset>193463</wp:posOffset>
+                  <wp:posOffset>250402</wp:posOffset>
                 </wp:positionV>
                 <wp:extent cx="6896478" cy="0"/>
                 <wp:effectExtent l="0" t="0" r="12700" b="12700"/>
@@ -531,13 +531,7 @@
                         <a:prstGeom prst="line">
                           <a:avLst/>
                         </a:prstGeom>
-                        <a:ln>
-                          <a:solidFill>
-                            <a:schemeClr val="bg1">
-                              <a:lumMod val="85000"/>
-                            </a:schemeClr>
-                          </a:solidFill>
-                        </a:ln>
+                        <a:ln/>
                       </wps:spPr>
                       <wps:style>
                         <a:lnRef idx="1">
@@ -565,7 +559,7 @@
           </mc:Choice>
           <mc:Fallback>
             <w:pict>
-              <v:line w14:anchorId="7543AEE3" id="Straight Connector 16" o:spid="_x0000_s1026" style="position:absolute;z-index:251659264;visibility:visible;mso-wrap-style:square;mso-width-percent:0;mso-wrap-distance-left:9pt;mso-wrap-distance-top:0;mso-wrap-distance-right:9pt;mso-wrap-distance-bottom:0;mso-position-horizontal:absolute;mso-position-horizontal-relative:text;mso-position-vertical:absolute;mso-position-vertical-relative:text;mso-width-percent:0;mso-width-relative:margin" from="0,15.25pt" to="543.05pt,15.25pt" o:gfxdata="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" strokecolor="#d8d8d8 [2732]" strokeweight="1pt">
+              <v:line w14:anchorId="283C71F3" id="Straight Connector 16" o:spid="_x0000_s1026" style="position:absolute;z-index:251659264;visibility:visible;mso-wrap-style:square;mso-width-percent:0;mso-wrap-distance-left:9pt;mso-wrap-distance-top:0;mso-wrap-distance-right:9pt;mso-wrap-distance-bottom:0;mso-position-horizontal:absolute;mso-position-horizontal-relative:text;mso-position-vertical:absolute;mso-position-vertical-relative:text;mso-width-percent:0;mso-width-relative:margin" from="0,19.7pt" to="543.05pt,19.7pt" o:gfxdata="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" strokecolor="black [3200]" strokeweight="1pt">
                 <v:stroke joinstyle="miter"/>
               </v:line>
             </w:pict>
@@ -625,6 +619,39 @@
           </w:rPr>
           <w:t/>
         </w:r>
+        <w:r>
+          <w:rPr>
+            <w:rFonts w:ascii="Source Sans Pro" w:eastAsia="Source Sans Pro" w:hAnsi="Source Sans Pro" w:cs="Source Sans Pro"/>
+            <w:b/>
+            <w:color w:val="000000"/>
+            <w:sz w:val="19"/>
+            <w:szCs w:val="19"/>
+            <w:u w:val="single"/>
+          </w:rPr>
+          <w:t/>
+        </w:r>
+        <w:r>
+          <w:rPr>
+            <w:rFonts w:ascii="Source Sans Pro" w:eastAsia="Source Sans Pro" w:hAnsi="Source Sans Pro" w:cs="Source Sans Pro"/>
+            <w:b/>
+            <w:color w:val="000000"/>
+            <w:sz w:val="19"/>
+            <w:szCs w:val="19"/>
+            <w:u w:val="single"/>
+          </w:rPr>
+          <w:t/>
+        </w:r>
+        <w:r>
+          <w:rPr>
+            <w:rFonts w:ascii="Source Sans Pro" w:eastAsia="Source Sans Pro" w:hAnsi="Source Sans Pro" w:cs="Source Sans Pro"/>
+            <w:b/>
+            <w:color w:val="000000"/>
+            <w:sz w:val="19"/>
+            <w:szCs w:val="19"/>
+            <w:u w:val="single"/>
+          </w:rPr>
+          <w:t/>
+        </w:r>
       </w:hyperlink>
       <w:r>
         <w:rPr>
@@ -668,7 +695,7 @@
           <w:sz w:val="19"/>
           <w:szCs w:val="19"/>
         </w:rPr>
-        <w:t>Deployed Splunk SIEM with SPL searches for brute-force detection, lateral movement, and privilege escalation; mapped TTPs to MITRE ATT&amp;CK and wrote PICERL incident report using Python, Splunk, and Wireshark.</w:t>
+        <w:t>Deployed Splunk SIEM with SPL correlation searches for brute-force detection, lateral movement, and privilege escalation; mapped TTPs to MITRE ATT&amp;CK and wrote PICERL incident report for FIRST.org.</w:t>
       </w:r>
     </w:p>
     <w:p>
@@ -687,7 +714,7 @@
           <w:sz w:val="19"/>
           <w:szCs w:val="19"/>
         </w:rPr>
-        <w:t>Developed SOAR-style detection pipeline using Python, Splunk, and VirusTotal API, ingesting Splunk alerts, enriching with IOC data, and dispatching Telegram notifications with severity classification.</w:t>
+        <w:t>Developed SOAR-style detection pipeline: Python script ingests Splunk alerts, enriches with VirusTotal API, and dispatches Telegram notifications with severity classification.</w:t>
       </w:r>
     </w:p>
     <w:p>
@@ -706,7 +733,7 @@
           <w:sz w:val="19"/>
           <w:szCs w:val="19"/>
         </w:rPr>
-        <w:t>Converted detection logic to Sigma rules using Python, Splunk, and Wireshark; analyzed TCP/IP for SYN scans, DNS tunnelling, and plaintext credential exposure.</w:t>
+        <w:t>Converted detection logic to Sigma rules (detection-as-code) for enterprise SOCs; analyzed TCP/IP traffic in Wireshark for SYN scans, DNS tunnelling, and plaintext credential exposure.</w:t>
       </w:r>
     </w:p>
     <w:p>
@@ -776,7 +803,7 @@
           <w:sz w:val="19"/>
           <w:szCs w:val="19"/>
         </w:rPr>
-        <w:t>Developed automated vulnerability assessment pipeline integrating Nessus and OpenVAS REST APIs using Python, generating CVE reports with CVSS severity and EPSS context from FIRST.org and NVD APIs.</w:t>
+        <w:t>Developed automated vulnerability assessment pipeline integrating Nessus and OpenVAS REST APIs in Python, generating CVE reports with CVSS severity and EPSS context from FIRST.org API.</w:t>
       </w:r>
     </w:p>
     <w:p>
@@ -795,7 +822,7 @@
           <w:sz w:val="19"/>
           <w:szCs w:val="19"/>
         </w:rPr>
-        <w:t>Developed OWASP Top 10 automated web checker using Python and Bash, detecting injection, auth, and SSRF vulnerabilities.</w:t>
+        <w:t>Developed OWASP Top 10 automated web checker to detect web vulnerabilities, including injection, auth, and SSRF, and documented SQL injection remediation.</w:t>
       </w:r>
     </w:p>
     <w:p>
@@ -814,7 +841,7 @@
           <w:sz w:val="19"/>
           <w:szCs w:val="19"/>
         </w:rPr>
-        <w:t>Automated scan scheduling using Bash and cron; built delta-scan logic to flag new CVEs and track patch compliance with Nessus, OpenVAS, and NVD API.</w:t>
+        <w:t>Automated scan scheduling via Bash and cron; built delta-scan logic to flag newly discovered CVEs and organize patch compliance (remediation tracking) tracking evidence.</w:t>
       </w:r>
     </w:p>
     <w:p>

</xml_diff>